<commit_message>
React rewrite + pedagogical enhancements + concept doc update
- Complete React rewrite (trainer_app.jsx) with useReducer state machine
- Decoy fields on neutral screens (L2/L3): 2-3 non-target fields with
  subtle blue styling to create multiple plausible click targets
- Consequence-based error feedback: structured "what would happen in
  production" panels on wrong clicks in L2+
- Post-level debrief screens: expandable "why each step matters" cards
  shown after completing L1/L2
- Audio cues via Web Audio API: correct/wrong tones, timer tick,
  win fanfare, timeout alert
- Review mode: 5 scrambled steps accessible from win screen (L1+)
- Adaptive hints: free hint after 3 consecutive wrong clicks in L2
- Updated concept.md and concept.docx with Generation Architecture
  section (source files, build process, AI content disclosure,
  pedagogical features)

Co-Authored-By: Claude Opus 4.6 <noreply@anthropic.com>
</commit_message>
<xml_diff>
--- a/docs/concept.docx
+++ b/docs/concept.docx
@@ -141,10 +141,7 @@
         <w:pStyle w:val="FirstParagraph"/>
       </w:pPr>
       <w:r>
-        <w:t xml:space="preserve">This is</w:t>
-      </w:r>
-      <w:r>
-        <w:t xml:space="preserve"> </w:t>
+        <w:t xml:space="preserve">This is </w:t>
       </w:r>
       <w:r>
         <w:rPr>
@@ -187,16 +184,7 @@
         <w:t xml:space="preserve">Goal:</w:t>
       </w:r>
       <w:r>
-        <w:t xml:space="preserve"> </w:t>
-      </w:r>
-      <w:r>
-        <w:t xml:space="preserve">“</w:t>
-      </w:r>
-      <w:r>
-        <w:t xml:space="preserve">I’m not lost.</w:t>
-      </w:r>
-      <w:r>
-        <w:t xml:space="preserve">”</w:t>
+        <w:t xml:space="preserve"> “I’m not lost.”</w:t>
       </w:r>
     </w:p>
     <w:p>
@@ -256,16 +244,7 @@
         <w:t xml:space="preserve">Goal:</w:t>
       </w:r>
       <w:r>
-        <w:t xml:space="preserve"> </w:t>
-      </w:r>
-      <w:r>
-        <w:t xml:space="preserve">“</w:t>
-      </w:r>
-      <w:r>
-        <w:t xml:space="preserve">I know where I fit.</w:t>
-      </w:r>
-      <w:r>
-        <w:t xml:space="preserve">”</w:t>
+        <w:t xml:space="preserve"> “I know where I fit.”</w:t>
       </w:r>
     </w:p>
     <w:p>
@@ -313,16 +292,7 @@
         <w:t xml:space="preserve">Goal:</w:t>
       </w:r>
       <w:r>
-        <w:t xml:space="preserve"> </w:t>
-      </w:r>
-      <w:r>
-        <w:t xml:space="preserve">“</w:t>
-      </w:r>
-      <w:r>
-        <w:t xml:space="preserve">I can do my job.</w:t>
-      </w:r>
-      <w:r>
-        <w:t xml:space="preserve">”</w:t>
+        <w:t xml:space="preserve"> “I can do my job.”</w:t>
       </w:r>
     </w:p>
     <w:p>
@@ -394,16 +364,7 @@
         <w:t xml:space="preserve">Goal:</w:t>
       </w:r>
       <w:r>
-        <w:t xml:space="preserve"> </w:t>
-      </w:r>
-      <w:r>
-        <w:t xml:space="preserve">“</w:t>
-      </w:r>
-      <w:r>
-        <w:t xml:space="preserve">Help me while I’m doing it.</w:t>
-      </w:r>
-      <w:r>
-        <w:t xml:space="preserve">”</w:t>
+        <w:t xml:space="preserve"> “Help me while I’m doing it.”</w:t>
       </w:r>
     </w:p>
     <w:p>
@@ -463,16 +424,7 @@
         <w:t xml:space="preserve">Goal:</w:t>
       </w:r>
       <w:r>
-        <w:t xml:space="preserve"> </w:t>
-      </w:r>
-      <w:r>
-        <w:t xml:space="preserve">“</w:t>
-      </w:r>
-      <w:r>
-        <w:t xml:space="preserve">I understand</w:t>
-      </w:r>
-      <w:r>
-        <w:t xml:space="preserve"> </w:t>
+        <w:t xml:space="preserve"> “I understand </w:t>
       </w:r>
       <w:r>
         <w:rPr>
@@ -481,13 +433,7 @@
         <w:t xml:space="preserve">why</w:t>
       </w:r>
       <w:r>
-        <w:t xml:space="preserve"> </w:t>
-      </w:r>
-      <w:r>
-        <w:t xml:space="preserve">we do it this way.</w:t>
-      </w:r>
-      <w:r>
-        <w:t xml:space="preserve">”</w:t>
+        <w:t xml:space="preserve"> we do it this way.”</w:t>
       </w:r>
     </w:p>
     <w:p>
@@ -551,10 +497,7 @@
         <w:pStyle w:val="FirstParagraph"/>
       </w:pPr>
       <w:r>
-        <w:t xml:space="preserve">Sourced from: BPMN decision gateways, Tosca negative test cases, Opal overlay validation rules, and a</w:t>
-      </w:r>
-      <w:r>
-        <w:t xml:space="preserve"> </w:t>
+        <w:t xml:space="preserve">Sourced from: BPMN decision gateways, Tosca negative test cases, Opal overlay validation rules, and a </w:t>
       </w:r>
       <w:r>
         <w:rPr>
@@ -563,10 +506,7 @@
         <w:t xml:space="preserve">consequences.yaml</w:t>
       </w:r>
       <w:r>
-        <w:t xml:space="preserve"> </w:t>
-      </w:r>
-      <w:r>
-        <w:t xml:space="preserve">data file maintained by the SME team. SME review and Finance/Compliance sign-off required before publication.</w:t>
+        <w:t xml:space="preserve"> data file maintained by the SME team. SME review and Finance/Compliance sign-off required before publication.</w:t>
       </w:r>
     </w:p>
     <w:p>
@@ -590,16 +530,7 @@
         <w:t xml:space="preserve">Goal:</w:t>
       </w:r>
       <w:r>
-        <w:t xml:space="preserve"> </w:t>
-      </w:r>
-      <w:r>
-        <w:t xml:space="preserve">“</w:t>
-      </w:r>
-      <w:r>
-        <w:t xml:space="preserve">Training is never outdated.</w:t>
-      </w:r>
-      <w:r>
-        <w:t xml:space="preserve">”</w:t>
+        <w:t xml:space="preserve"> “Training is never outdated.”</w:t>
       </w:r>
     </w:p>
     <w:p>
@@ -899,11 +830,11 @@
     </w:p>
     <w:p>
       <w:pPr>
+        <w:pStyle w:val="Compact"/>
         <w:numPr>
           <w:ilvl w:val="0"/>
           <w:numId w:val="1009"/>
         </w:numPr>
-        <w:pStyle w:val="Compact"/>
       </w:pPr>
       <w:r>
         <w:rPr>
@@ -912,19 +843,16 @@
         <w:t xml:space="preserve">Progressive levels:</w:t>
       </w:r>
       <w:r>
-        <w:t xml:space="preserve"> </w:t>
-      </w:r>
-      <w:r>
-        <w:t xml:space="preserve">Level 0 (UI basics) → Level 1 (guided steps with prompts) → Level 2 (semi-guided, hints available but delayed) → Level 3 (challenge/boss-fight mode: real task, timer, no prompts)</w:t>
-      </w:r>
-    </w:p>
-    <w:p>
-      <w:pPr>
+        <w:t xml:space="preserve"> Level 0 (UI basics) → Level 1 (guided steps with prompts) → Level 2 (semi-guided, hints available but delayed) → Level 3 (challenge/boss-fight mode: real task, timer, no prompts)</w:t>
+      </w:r>
+    </w:p>
+    <w:p>
+      <w:pPr>
+        <w:pStyle w:val="Compact"/>
         <w:numPr>
           <w:ilvl w:val="0"/>
           <w:numId w:val="1009"/>
         </w:numPr>
-        <w:pStyle w:val="Compact"/>
       </w:pPr>
       <w:r>
         <w:rPr>
@@ -933,19 +861,16 @@
         <w:t xml:space="preserve">XP and achievement badges:</w:t>
       </w:r>
       <w:r>
-        <w:t xml:space="preserve"> </w:t>
-      </w:r>
-      <w:r>
-        <w:t xml:space="preserve">Milestone recognition for first posting, first catch of a discrepancy, fastest goods receipt</w:t>
-      </w:r>
-    </w:p>
-    <w:p>
-      <w:pPr>
+        <w:t xml:space="preserve"> Milestone recognition for first posting, first catch of a discrepancy, fastest goods receipt</w:t>
+      </w:r>
+    </w:p>
+    <w:p>
+      <w:pPr>
+        <w:pStyle w:val="Compact"/>
         <w:numPr>
           <w:ilvl w:val="0"/>
           <w:numId w:val="1009"/>
         </w:numPr>
-        <w:pStyle w:val="Compact"/>
       </w:pPr>
       <w:r>
         <w:rPr>
@@ -954,19 +879,16 @@
         <w:t xml:space="preserve">Timer:</w:t>
       </w:r>
       <w:r>
-        <w:t xml:space="preserve"> </w:t>
-      </w:r>
-      <w:r>
-        <w:t xml:space="preserve">Visible countdown in challenge mode, score based on speed and accuracy</w:t>
-      </w:r>
-    </w:p>
-    <w:p>
-      <w:pPr>
+        <w:t xml:space="preserve"> Visible countdown in challenge mode, score based on speed and accuracy</w:t>
+      </w:r>
+    </w:p>
+    <w:p>
+      <w:pPr>
+        <w:pStyle w:val="Compact"/>
         <w:numPr>
           <w:ilvl w:val="0"/>
           <w:numId w:val="1009"/>
         </w:numPr>
-        <w:pStyle w:val="Compact"/>
       </w:pPr>
       <w:r>
         <w:rPr>
@@ -975,19 +897,16 @@
         <w:t xml:space="preserve">Leaderboard:</w:t>
       </w:r>
       <w:r>
-        <w:t xml:space="preserve"> </w:t>
-      </w:r>
-      <w:r>
-        <w:t xml:space="preserve">Site-level competition — who cleared goods receipt fastest this week</w:t>
-      </w:r>
-    </w:p>
-    <w:p>
-      <w:pPr>
+        <w:t xml:space="preserve"> Site-level competition — who cleared goods receipt fastest this week</w:t>
+      </w:r>
+    </w:p>
+    <w:p>
+      <w:pPr>
+        <w:pStyle w:val="Compact"/>
         <w:numPr>
           <w:ilvl w:val="0"/>
           <w:numId w:val="1009"/>
         </w:numPr>
-        <w:pStyle w:val="Compact"/>
       </w:pPr>
       <w:r>
         <w:rPr>
@@ -996,31 +915,16 @@
         <w:t xml:space="preserve">Narrative stakes:</w:t>
       </w:r>
       <w:r>
-        <w:t xml:space="preserve"> </w:t>
-      </w:r>
-      <w:r>
-        <w:t xml:space="preserve">“</w:t>
-      </w:r>
-      <w:r>
-        <w:t xml:space="preserve">The truck has been at the dock for 45 minutes. Dock fees start in 15. Post the goods receipt.</w:t>
-      </w:r>
-      <w:r>
-        <w:t xml:space="preserve">”</w:t>
-      </w:r>
-      <w:r>
-        <w:t xml:space="preserve"> </w:t>
-      </w:r>
-      <w:r>
-        <w:t xml:space="preserve">Pressure without actual consequences.</w:t>
-      </w:r>
-    </w:p>
-    <w:p>
-      <w:pPr>
+        <w:t xml:space="preserve"> “The truck has been at the dock for 45 minutes. Dock fees start in 15. Post the goods receipt.” Pressure without actual consequences.</w:t>
+      </w:r>
+    </w:p>
+    <w:p>
+      <w:pPr>
+        <w:pStyle w:val="Compact"/>
         <w:numPr>
           <w:ilvl w:val="0"/>
           <w:numId w:val="1009"/>
         </w:numPr>
-        <w:pStyle w:val="Compact"/>
       </w:pPr>
       <w:r>
         <w:rPr>
@@ -1029,43 +933,7 @@
         <w:t xml:space="preserve">Confetti and feedback:</w:t>
       </w:r>
       <w:r>
-        <w:t xml:space="preserve"> </w:t>
-      </w:r>
-      <w:r>
-        <w:t xml:space="preserve">Immediate positive reinforcement on successful posting; empathetic error explanations (not</w:t>
-      </w:r>
-      <w:r>
-        <w:t xml:space="preserve"> </w:t>
-      </w:r>
-      <w:r>
-        <w:t xml:space="preserve">“</w:t>
-      </w:r>
-      <w:r>
-        <w:t xml:space="preserve">wrong,</w:t>
-      </w:r>
-      <w:r>
-        <w:t xml:space="preserve">”</w:t>
-      </w:r>
-      <w:r>
-        <w:t xml:space="preserve"> </w:t>
-      </w:r>
-      <w:r>
-        <w:t xml:space="preserve">but</w:t>
-      </w:r>
-      <w:r>
-        <w:t xml:space="preserve"> </w:t>
-      </w:r>
-      <w:r>
-        <w:t xml:space="preserve">“</w:t>
-      </w:r>
-      <w:r>
-        <w:t xml:space="preserve">here’s what that would have caused downstream</w:t>
-      </w:r>
-      <w:r>
-        <w:t xml:space="preserve">”</w:t>
-      </w:r>
-      <w:r>
-        <w:t xml:space="preserve">)</w:t>
+        <w:t xml:space="preserve"> Immediate positive reinforcement on successful posting; empathetic error explanations (not “wrong,” but “here’s what that would have caused downstream”)</w:t>
       </w:r>
     </w:p>
     <w:p>
@@ -1088,6 +956,158 @@
       <w:pPr>
         <w:pStyle w:val="Heading2"/>
       </w:pPr>
+      <w:bookmarkStart w:id="40" w:name="generation-architecture-ui-trainer"/>
+      <w:r>
+        <w:t xml:space="preserve">Generation Architecture (UI Trainer)</w:t>
+      </w:r>
+      <w:bookmarkEnd w:id="40"/>
+    </w:p>
+    <w:p>
+      <w:pPr>
+        <w:pStyle w:val="FirstParagraph"/>
+      </w:pPr>
+      <w:r>
+        <w:t xml:space="preserve">The interactive UI trainer is fully generated from source — no AI is involved at build time or runtime. A single command produces a self-contained HTML file and all screen images. There is no server, no API call, and no model inference in the pipeline.</w:t>
+      </w:r>
+    </w:p>
+    <w:p>
+      <w:pPr>
+        <w:pStyle w:val="Heading3"/>
+      </w:pPr>
+      <w:bookmarkStart w:id="41" w:name="source-files"/>
+      <w:r>
+        <w:t xml:space="preserve">Source Files</w:t>
+      </w:r>
+      <w:bookmarkEnd w:id="41"/>
+    </w:p>
+    <w:p>
+      <w:pPr>
+        <w:pStyle w:val="FirstParagraph"/>
+      </w:pPr>
+      <w:r>
+        <w:t xml:space="preserve">Three files comprise the entire source:</w:t>
+      </w:r>
+    </w:p>
+    <w:p>
+      <w:pPr>
+        <w:pStyle w:val="Compact"/>
+        <w:numPr>
+          <w:ilvl w:val="0"/>
+          <w:numId w:val="1009"/>
+        </w:numPr>
+      </w:pPr>
+      <w:r>
+        <w:rPr>
+          <w:rStyle w:val="VerbatimChar"/>
+        </w:rPr>
+        <w:t xml:space="preserve">scenarios/base.py</w:t>
+      </w:r>
+      <w:r>
+        <w:t xml:space="preserve"> — Shared Pillow drawing primitives (fields, dropdowns, buttons, tables, checkboxes, shell bar). This is the visual component library that renders SAP Fiori-style UI elements as static PNGs.</w:t>
+      </w:r>
+    </w:p>
+    <w:p>
+      <w:pPr>
+        <w:pStyle w:val="Compact"/>
+        <w:numPr>
+          <w:ilvl w:val="0"/>
+          <w:numId w:val="1009"/>
+        </w:numPr>
+      </w:pPr>
+      <w:r>
+        <w:rPr>
+          <w:rStyle w:val="VerbatimChar"/>
+        </w:rPr>
+        <w:t xml:space="preserve">scenarios/sedc_goods_receipt.py</w:t>
+      </w:r>
+      <w:r>
+        <w:t xml:space="preserve"> — The scenario pack. Contains the complete scenario definition (all steps with goals, instructions, hints, hotspots, consequences, and explore descriptions) plus the screen generator functions that draw each screen using the base helpers. Each scenario pack is self-contained and can be swapped or duplicated for different handling profiles.</w:t>
+      </w:r>
+    </w:p>
+    <w:p>
+      <w:pPr>
+        <w:pStyle w:val="Compact"/>
+        <w:numPr>
+          <w:ilvl w:val="0"/>
+          <w:numId w:val="1009"/>
+        </w:numPr>
+      </w:pPr>
+      <w:r>
+        <w:rPr>
+          <w:rStyle w:val="VerbatimChar"/>
+        </w:rPr>
+        <w:t xml:space="preserve">trainer_app.jsx</w:t>
+      </w:r>
+      <w:r>
+        <w:t xml:space="preserve"> — The React application (~46K chars). This is the game engine: a useReducer state machine drives all four progression levels plus review mode. It reads scenario data injected as JSON globals and renders the interactive experience entirely client-side.</w:t>
+      </w:r>
+    </w:p>
+    <w:p>
+      <w:pPr>
+        <w:pStyle w:val="Heading3"/>
+      </w:pPr>
+      <w:bookmarkStart w:id="42" w:name="build-process"/>
+      <w:r>
+        <w:t xml:space="preserve">Build Process</w:t>
+      </w:r>
+      <w:bookmarkEnd w:id="42"/>
+    </w:p>
+    <w:p>
+      <w:pPr>
+        <w:pStyle w:val="FirstParagraph"/>
+      </w:pPr>
+      <w:r>
+        <w:t xml:space="preserve">The generator script reads the scenario module, calls its generate_screens() function (which renders 18 PNGs — 9 highlighted for Levels 0–1 and 9 neutral for Levels 2–3), reads the JSX file, and injects three JSON blobs (scenario data, highlighted screen paths, neutral screen paths) plus the JSX source into a single HTML wrapper. The output is a standalone directory: index.html plus two screen folders.</w:t>
+      </w:r>
+    </w:p>
+    <w:p>
+      <w:pPr>
+        <w:pStyle w:val="Heading3"/>
+      </w:pPr>
+      <w:bookmarkStart w:id="43" w:name="where-ai-contributed-content"/>
+      <w:r>
+        <w:t xml:space="preserve">Where AI Contributed Content</w:t>
+      </w:r>
+      <w:bookmarkEnd w:id="43"/>
+    </w:p>
+    <w:p>
+      <w:pPr>
+        <w:pStyle w:val="FirstParagraph"/>
+      </w:pPr>
+      <w:r>
+        <w:t xml:space="preserve">AI (Claude) authored the following content during the development process, not at runtime: all consequence descriptions (what happens in production if a step is done wrong), all explore-mode element descriptions, the narrative premises for Level 3, and the hint text for each step. These are plausible SAP MIGO descriptions based on general warehouse receiving knowledge but are not sourced from an actual SE-DC standard operating procedure or SAP configuration. For a real deployment, these strings would require SME review to ensure accuracy against the site’s specific process.</w:t>
+      </w:r>
+    </w:p>
+    <w:p>
+      <w:pPr>
+        <w:pStyle w:val="BodyText"/>
+      </w:pPr>
+      <w:r>
+        <w:t xml:space="preserve">Pixel coordinates for hotspots and field positions are calculated deterministically from the Pillow drawing code, not estimated or AI-generated.</w:t>
+      </w:r>
+    </w:p>
+    <w:p>
+      <w:pPr>
+        <w:pStyle w:val="Heading3"/>
+      </w:pPr>
+      <w:bookmarkStart w:id="44" w:name="pedagogical-features"/>
+      <w:r>
+        <w:t xml:space="preserve">Pedagogical Features</w:t>
+      </w:r>
+      <w:bookmarkEnd w:id="44"/>
+    </w:p>
+    <w:p>
+      <w:pPr>
+        <w:pStyle w:val="FirstParagraph"/>
+      </w:pPr>
+      <w:r>
+        <w:t xml:space="preserve">The current build includes six pedagogical mechanics beyond the base four-level progression: consequence-based elaborated error feedback (structured “what would happen in production” panels on wrong clicks in Levels 2–3), post-level debrief screens (expandable “why each step matters” cards shown after Levels 1–2), audio cues via Web Audio API (correct/wrong tones, timer tick in the last 10 seconds, win fanfare, timeout alert), a Review mode (5 randomly selected steps in scrambled order, accessible from the win screen), an adaptive hint system (after 3 consecutive wrong clicks in Level 2, the next hint becomes free), and decoy fields on neutral screens (2–3 non-target fields styled with subtle blue borders and tints to create multiple plausible click targets).</w:t>
+      </w:r>
+    </w:p>
+    <w:p>
+      <w:pPr>
+        <w:pStyle w:val="Heading2"/>
+      </w:pPr>
       <w:bookmarkStart w:id="33" w:name="why-this-is-credible-now"/>
       <w:r>
         <w:t xml:space="preserve">Why This Is Credible Now</w:t>
@@ -1099,19 +1119,7 @@
         <w:pStyle w:val="FirstParagraph"/>
       </w:pPr>
       <w:r>
-        <w:t xml:space="preserve">The same AI techniques used to rapidly generate viral video content (</w:t>
-      </w:r>
-      <w:r>
-        <w:t xml:space="preserve">“</w:t>
-      </w:r>
-      <w:r>
-        <w:t xml:space="preserve">Bigfoot videos</w:t>
-      </w:r>
-      <w:r>
-        <w:t xml:space="preserve">”</w:t>
-      </w:r>
-      <w:r>
-        <w:t xml:space="preserve">) are applied here in a governed, enterprise-safe way: script generation, video generation, workflow orchestration, and minimal human editing.</w:t>
+        <w:t>The same AI techniques used to rapidly generate viral video content (“Bigfoot videos”) are applied here in a governed, enterprise-safe way: script generation, video generation, workflow orchestration, and minimal human editing.</w:t>
       </w:r>
     </w:p>
     <w:p>
@@ -1145,25 +1153,7 @@
         <w:pStyle w:val="FirstParagraph"/>
       </w:pPr>
       <w:r>
-        <w:t xml:space="preserve">This PoC uses a fictional company —</w:t>
-      </w:r>
-      <w:r>
-        <w:t xml:space="preserve"> </w:t>
-      </w:r>
-      <w:r>
-        <w:t xml:space="preserve">“</w:t>
-      </w:r>
-      <w:r>
-        <w:t xml:space="preserve">GlobalMart Southeast Distribution Center</w:t>
-      </w:r>
-      <w:r>
-        <w:t xml:space="preserve">”</w:t>
-      </w:r>
-      <w:r>
-        <w:t xml:space="preserve"> </w:t>
-      </w:r>
-      <w:r>
-        <w:t xml:space="preserve">— with entirely fabricated process data, test scripts, and site configurations. No real enterprise data is used.</w:t>
+        <w:t>This PoC uses a fictional company — “GlobalMart Southeast Distribution Center” — with entirely fabricated process data, test scripts, and site configurations. No real enterprise data is used.</w:t>
       </w:r>
     </w:p>
     <w:p>
@@ -1284,10 +1274,7 @@
         <w:t xml:space="preserve">Goal:</w:t>
       </w:r>
       <w:r>
-        <w:t xml:space="preserve"> </w:t>
-      </w:r>
-      <w:r>
-        <w:t xml:space="preserve">Prove speed, accuracy, and maintainability — not perfection.</w:t>
+        <w:t xml:space="preserve"> Prove speed, accuracy, and maintainability — not perfection.</w:t>
       </w:r>
     </w:p>
     <w:p>
@@ -1331,13 +1318,7 @@
         <w:pStyle w:val="BlockText"/>
       </w:pPr>
       <w:r>
-        <w:t xml:space="preserve">“</w:t>
-      </w:r>
-      <w:r>
-        <w:t xml:space="preserve">We’re not building training. We’re compiling it from the same assets that already keep the system running.</w:t>
-      </w:r>
-      <w:r>
-        <w:t xml:space="preserve">”</w:t>
+        <w:t>“We’re not building training. We’re compiling it from the same assets that already keep the system running.”</w:t>
       </w:r>
     </w:p>
     <w:sectPr/>

</xml_diff>